<commit_message>
feat: CV and resume update, informations update
</commit_message>
<xml_diff>
--- a/output/docx/shine-bo-bo-cv.docx
+++ b/output/docx/shine-bo-bo-cv.docx
@@ -119,7 +119,7 @@
     </w:p>
     <w:p>
       <w:r>
-        <w:t>Computer Science graduate and third-year Digital Engineering student with project-based experience across full-stack web applications, backend APIs, AI/ML prototypes, IoT simulation, and practical PC hardware work. I combine technical learning with international student leadership, cross-cultural collaboration, and customer-facing problem-solving. I am seeking software development, full-stack/backend, or digital engineering internship and junior opportunities.</w:t>
+        <w:t>Computer Science graduate and third-year Digital Engineering student with project-based experience across full-stack web applications, backend APIs, AI/ML prototypes, IoT simulation, and practical PC hardware work. I combine technical learning with international student leadership, cross-cultural collaboration, and customer-facing problem-solving. International exchanges and community activities have strengthened my interest in people-centred technology and small, practical contributions that support sustainable innovation, cultural understanding, inclusion, and wellbeing. I am seeking software development, full-stack/backend, or digital engineering internship and junior opportunities.</w:t>
       </w:r>
     </w:p>
     <w:p>
@@ -398,7 +398,7 @@
           <w:color w:val="0F172A"/>
           <w:sz w:val="18"/>
         </w:rPr>
-        <w:t xml:space="preserve">PC hardware: </w:t>
+        <w:t xml:space="preserve">Hardware and resale: </w:t>
       </w:r>
       <w:r>
         <w:rPr>
@@ -406,7 +406,7 @@
           <w:color w:val="475569"/>
           <w:sz w:val="18"/>
         </w:rPr>
-        <w:t>Component selection, compatibility planning, custom PC assembly, diagnostics, troubleshooting, sourcing, resale, and basic after-sales support</w:t>
+        <w:t>PC component selection, compatibility planning, custom PC assembly, diagnostics, troubleshooting, and PC, camera, and lens sourcing, resale, and basic after-sales support</w:t>
       </w:r>
     </w:p>
     <w:p>
@@ -429,6 +429,24 @@
           <w:sz w:val="18"/>
         </w:rPr>
         <w:t>Networking, cybersecurity, cryptography, computer architecture, operating systems, systems thinking, and engineering design</w:t>
+      </w:r>
+    </w:p>
+    <w:p>
+      <w:pPr>
+        <w:pStyle w:val="Heading1"/>
+      </w:pPr>
+      <w:r>
+        <w:t>Core Strengths</w:t>
+      </w:r>
+    </w:p>
+    <w:p>
+      <w:r>
+        <w:rPr>
+          <w:rFonts w:ascii="Arial" w:hAnsi="Arial"/>
+          <w:color w:val="475569"/>
+          <w:sz w:val="18"/>
+        </w:rPr>
+        <w:t>Inclusive leadership and coordination | Cross-cultural collaboration | Communication and customer awareness | Practical problem-solving and adaptability | Social awareness and empathy</w:t>
       </w:r>
     </w:p>
     <w:p>
@@ -554,13 +572,9 @@
       </w:r>
     </w:p>
     <w:p>
-      <w:r>
-        <w:br w:type="page"/>
-      </w:r>
-    </w:p>
-    <w:p>
       <w:pPr>
         <w:pStyle w:val="Heading1"/>
+        <w:pageBreakBefore/>
       </w:pPr>
       <w:r>
         <w:t>Experience and Leadership - Continued</w:t>
@@ -578,7 +592,7 @@
           <w:color w:val="0F172A"/>
           <w:sz w:val="19"/>
         </w:rPr>
-        <w:t>Freelance Gaming PC Buyer, Builder and Reseller</w:t>
+        <w:t>Family Business Assistant | Freelance PC Builder and PC, Camera and Lens Reseller</w:t>
       </w:r>
     </w:p>
     <w:p>
@@ -592,7 +606,7 @@
           <w:color w:val="64748B"/>
           <w:sz w:val="16"/>
         </w:rPr>
-        <w:t>Self-Employed / Family Business | Jan 2022-Jul 2024</w:t>
+        <w:t>Family business support and self-employed work | Jan 2022-Jul 2024</w:t>
       </w:r>
     </w:p>
     <w:p>
@@ -606,7 +620,7 @@
           <w:color w:val="475569"/>
           <w:sz w:val="18"/>
         </w:rPr>
-        <w:t>Matched components to customer needs, budgets, and compatibility constraints; sourced parts, assembled systems, and performed setup, diagnostics, and troubleshooting.</w:t>
+        <w:t>Assisted with daily family-business operations, including customer service, purchasing and sales, deliveries, cash handling, basic expense tracking, order coordination, and price negotiation.</w:t>
       </w:r>
     </w:p>
     <w:p>
@@ -620,7 +634,21 @@
           <w:color w:val="475569"/>
           <w:sz w:val="18"/>
         </w:rPr>
-        <w:t>Handled pricing, negotiation, customer communication, delivery, and basic after-sales support while assisting with day-to-day family-business operations.</w:t>
+        <w:t>Independently sourced, bought, and resold PCs, computer components, cameras, and lenses; assessed customer needs, budgets, product condition, and compatibility where applicable.</w:t>
+      </w:r>
+    </w:p>
+    <w:p>
+      <w:pPr>
+        <w:pStyle w:val="ListBullet"/>
+        <w:keepLines/>
+      </w:pPr>
+      <w:r>
+        <w:rPr>
+          <w:rFonts w:ascii="Arial" w:hAnsi="Arial"/>
+          <w:color w:val="475569"/>
+          <w:sz w:val="18"/>
+        </w:rPr>
+        <w:t>Assembled custom PCs and performed setup, diagnostics, and troubleshooting while managing customer communication, delivery, and basic after-sales support.</w:t>
       </w:r>
     </w:p>
     <w:p>
@@ -1088,19 +1116,6 @@
       </w:r>
     </w:p>
     <w:p>
-      <w:r>
-        <w:br w:type="page"/>
-      </w:r>
-    </w:p>
-    <w:p>
-      <w:pPr>
-        <w:pStyle w:val="Heading1"/>
-      </w:pPr>
-      <w:r>
-        <w:t>Selected Technical Projects - Continued</w:t>
-      </w:r>
-    </w:p>
-    <w:p>
       <w:pPr>
         <w:pStyle w:val="Heading3"/>
         <w:keepNext/>
@@ -1274,6 +1289,7 @@
     <w:p>
       <w:pPr>
         <w:pStyle w:val="Heading1"/>
+        <w:pageBreakBefore/>
       </w:pPr>
       <w:r>
         <w:t>Additional Project Work</w:t>
@@ -1421,7 +1437,7 @@
           <w:color w:val="475569"/>
           <w:sz w:val="18"/>
         </w:rPr>
-        <w:t>PSU Delegate, Asian Undergraduate Symposium 2026 - NUS College, Singapore, 6-18 Jul 2026; represented PSU's College of Computing in the Communities in Action regional program.</w:t>
+        <w:t>PSU Delegate, Asian Undergraduate Symposium 2026 - NUS College, Singapore, 6-18 Jul 2026; joined the Communities in Action regional program focused on sustainability and innovation, inclusivity and resilience, and heritage and culture.</w:t>
       </w:r>
     </w:p>
     <w:p>
@@ -1449,7 +1465,7 @@
           <w:color w:val="475569"/>
           <w:sz w:val="18"/>
         </w:rPr>
-        <w:t>Participant, cross-cultural Data Analysis and Visualization Workshops at PSU Phuket with SIT, Sojo University, Osaka Metropolitan University, and Shunan University in 2024 and 2025.</w:t>
+        <w:t>Participant, cross-cultural Data Analysis and Visualization Workshops at PSU Phuket with SIT, Sojo University, Osaka Metropolitan University, and Shunan University in 2024 and 2025; connected data practice with cultural exchange, local context, and wellbeing-focused learning.</w:t>
       </w:r>
     </w:p>
     <w:p>
@@ -1518,7 +1534,20 @@
     </w:p>
     <w:p>
       <w:r>
-        <w:t>Burmese - Native | English - Fluent | Korean - Basic coursework</w:t>
+        <w:t>Burmese - Native | English - Fluent | Thai - Basic (currently learning) | Korean - Basic coursework</w:t>
+      </w:r>
+    </w:p>
+    <w:p>
+      <w:pPr>
+        <w:pStyle w:val="Heading1"/>
+      </w:pPr>
+      <w:r>
+        <w:t>Professional and Social Interests</w:t>
+      </w:r>
+    </w:p>
+    <w:p>
+      <w:r>
+        <w:t>People-centred digital systems, sustainable and responsible innovation, cross-cultural collaboration, inclusive communities, youth wellbeing and mental-health awareness, and practical technology for positive local impact.</w:t>
       </w:r>
     </w:p>
     <w:p>

</xml_diff>